<commit_message>
Remove boiling-water proverb from revised Big Three script
Co-Authored-By: Claude Opus 5.5 <noreply@anthropic.com>
Claude-Session: https://claude.ai/code/session_017L5JoR9DyhpmK4GRa5GQhM
</commit_message>
<xml_diff>
--- a/THE BIG THREE SCRIPT - UNDER 2 MIN.docx
+++ b/THE BIG THREE SCRIPT - UNDER 2 MIN.docx
@@ -59,7 +59,7 @@
           <w:sz w:val="22"/>
           <w:szCs w:val="22"/>
         </w:rPr>
-        <w:t xml:space="preserve"> original about 317 words (roughly 2:20–2:30 read aloud); revised about 240 words (roughly 1:45–1:50 at a measured 130–140 words per minute, with room for pauses).</w:t>
+        <w:t xml:space="preserve"> original about 317 words (roughly 2:20–2:30 read aloud); revised about 220 words (roughly 1:35–1:40 at a measured 130–140 words per minute, with room for pauses).</w:t>
       </w:r>
     </w:p>
     <w:p>
@@ -442,34 +442,6 @@
       <w:r>
         <w:rPr>
           <w:rFonts w:ascii="Calibri" w:cs="Calibri" w:eastAsia="Calibri" w:hAnsi="Calibri"/>
-          <w:b/>
-          <w:bCs/>
-          <w:sz w:val="24"/>
-          <w:szCs w:val="24"/>
-        </w:rPr>
-        <w:t xml:space="preserve">"The same boiling water that softens the potato hardens the egg."</w:t>
-      </w:r>
-    </w:p>
-    <w:p>
-      <w:pPr>
-        <w:spacing w:after="120" w:line="300"/>
-      </w:pPr>
-      <w:r>
-        <w:rPr>
-          <w:rFonts w:ascii="Calibri" w:cs="Calibri" w:eastAsia="Calibri" w:hAnsi="Calibri"/>
-          <w:sz w:val="24"/>
-          <w:szCs w:val="24"/>
-        </w:rPr>
-        <w:t xml:space="preserve">Circumstances test everyone. Your response shapes who you become.</w:t>
-      </w:r>
-    </w:p>
-    <w:p>
-      <w:pPr>
-        <w:spacing w:after="120" w:line="300"/>
-      </w:pPr>
-      <w:r>
-        <w:rPr>
-          <w:rFonts w:ascii="Calibri" w:cs="Calibri" w:eastAsia="Calibri" w:hAnsi="Calibri"/>
           <w:sz w:val="24"/>
           <w:szCs w:val="24"/>
         </w:rPr>
@@ -654,7 +626,7 @@
           <w:sz w:val="22"/>
           <w:szCs w:val="22"/>
         </w:rPr>
-        <w:t xml:space="preserve">Every core idea from the original stays: the hook, the three pillars, the Stoic quote, a proverb, the three questions and the closing line. Cuts come from repetition, on-screen labels and a few extra words.</w:t>
+        <w:t xml:space="preserve">Every core idea from the original stays: the hook, the three pillars, the Stoic quote, the three questions and the closing line. Cuts come from repetition, on-screen labels, the two proverbs and a few extra words.</w:t>
       </w:r>
     </w:p>
     <w:tbl>
@@ -1244,30 +1216,30 @@
                 <w:sz w:val="20"/>
                 <w:szCs w:val="20"/>
               </w:rPr>
-              <w:t xml:space="preserve">Kept the boiling-water proverb; removed "birds of sorrow" and its follow-up line. Dropped the "Two Reflective Proverbs" label.</w:t>
-            </w:r>
-          </w:p>
-        </w:tc>
-        <w:tc>
-          <w:tcPr>
-            <w:tcW w:type="dxa" w:w="3380"/>
-            <w:tcMar>
-              <w:top w:type="dxa" w:w="80"/>
-              <w:left w:type="dxa" w:w="120"/>
-              <w:bottom w:type="dxa" w:w="80"/>
-              <w:right w:type="dxa" w:w="120"/>
-            </w:tcMar>
-          </w:tcPr>
-          <w:p>
-            <w:r>
-              <w:rPr>
-                <w:rFonts w:ascii="Calibri" w:cs="Calibri" w:eastAsia="Calibri" w:hAnsi="Calibri"/>
-                <w:b w:val="false"/>
-                <w:bCs w:val="false"/>
-                <w:sz w:val="20"/>
-                <w:szCs w:val="20"/>
-              </w:rPr>
-              <w:t xml:space="preserve">Boiling water carries the key point (your response shapes you) in fewer words. The birds proverb repeats "pain is temporary," which Perception already makes.</w:t>
+              <w:t xml:space="preserve">Removed both proverbs, their follow-up lines and the "Two Reflective Proverbs" label.</w:t>
+            </w:r>
+          </w:p>
+        </w:tc>
+        <w:tc>
+          <w:tcPr>
+            <w:tcW w:type="dxa" w:w="3380"/>
+            <w:tcMar>
+              <w:top w:type="dxa" w:w="80"/>
+              <w:left w:type="dxa" w:w="120"/>
+              <w:bottom w:type="dxa" w:w="80"/>
+              <w:right w:type="dxa" w:w="120"/>
+            </w:tcMar>
+          </w:tcPr>
+          <w:p>
+            <w:r>
+              <w:rPr>
+                <w:rFonts w:ascii="Calibri" w:cs="Calibri" w:eastAsia="Calibri" w:hAnsi="Calibri"/>
+                <w:b w:val="false"/>
+                <w:bCs w:val="false"/>
+                <w:sz w:val="20"/>
+                <w:szCs w:val="20"/>
+              </w:rPr>
+              <w:t xml:space="preserve">They restate ideas already made: the birds proverb repeats "pain is temporary" (Perception), and boiling water repeats "your response shapes you" (Will and the closing "command your response").</w:t>
             </w:r>
           </w:p>
         </w:tc>

</xml_diff>